<commit_message>
cadastroVIEW definido como classe Main (tela principal)
</commit_message>
<xml_diff>
--- a/Relatorio ATV2.docx
+++ b/Relatorio ATV2.docx
@@ -59,7 +59,7 @@
           <w:sz w:val="28"/>
           <w:szCs w:val="28"/>
         </w:rPr>
-        <w:t>https://github.com/ArturSilvaCosta/Git-UC11-ATV</w:t>
+        <w:t>https://github.com/ArturSilvaCosta/ATV</w:t>
       </w:r>
       <w:r>
         <w:rPr>
@@ -73,7 +73,7 @@
           <w:sz w:val="28"/>
           <w:szCs w:val="28"/>
         </w:rPr>
-        <w:t xml:space="preserve"> </w:t>
+        <w:t>-UC11</w:t>
       </w:r>
     </w:p>
     <w:p>
@@ -98,52 +98,182 @@
           <w:sz w:val="28"/>
           <w:szCs w:val="28"/>
         </w:rPr>
-        <w:t>Versionamento iniciado pelo Windows Explrorer (imagem 1)</w:t>
+        <w:t xml:space="preserve">Comandos </w:t>
+      </w:r>
+      <w:r>
+        <w:rPr>
+          <w:sz w:val="28"/>
+          <w:szCs w:val="28"/>
+        </w:rPr>
+        <w:t xml:space="preserve">para </w:t>
+      </w:r>
+      <w:proofErr w:type="spellStart"/>
+      <w:r>
+        <w:rPr>
+          <w:sz w:val="28"/>
+          <w:szCs w:val="28"/>
+        </w:rPr>
+        <w:t>Commit</w:t>
+      </w:r>
+      <w:proofErr w:type="spellEnd"/>
+      <w:r>
+        <w:rPr>
+          <w:sz w:val="28"/>
+          <w:szCs w:val="28"/>
+        </w:rPr>
+        <w:t xml:space="preserve"> 1 (“Projeto inicial”).</w:t>
       </w:r>
     </w:p>
     <w:p>
-      <w:r>
-        <w:rPr>
-          <w:noProof/>
-        </w:rPr>
-        <w:drawing>
-          <wp:inline distT="0" distB="0" distL="0" distR="0" wp14:anchorId="370D25C3" wp14:editId="52862105">
-            <wp:extent cx="5400040" cy="5647055"/>
-            <wp:effectExtent l="0" t="0" r="0" b="0"/>
-            <wp:docPr id="1863777620" name="Imagem 1"/>
-            <wp:cNvGraphicFramePr>
-              <a:graphicFrameLocks xmlns:a="http://schemas.openxmlformats.org/drawingml/2006/main" noChangeAspect="1"/>
-            </wp:cNvGraphicFramePr>
-            <a:graphic xmlns:a="http://schemas.openxmlformats.org/drawingml/2006/main">
-              <a:graphicData uri="http://schemas.openxmlformats.org/drawingml/2006/picture">
-                <pic:pic xmlns:pic="http://schemas.openxmlformats.org/drawingml/2006/picture">
-                  <pic:nvPicPr>
-                    <pic:cNvPr id="1863777620" name=""/>
-                    <pic:cNvPicPr/>
-                  </pic:nvPicPr>
-                  <pic:blipFill>
-                    <a:blip r:embed="rId5"/>
-                    <a:stretch>
-                      <a:fillRect/>
-                    </a:stretch>
-                  </pic:blipFill>
-                  <pic:spPr>
-                    <a:xfrm>
-                      <a:off x="0" y="0"/>
-                      <a:ext cx="5400040" cy="5647055"/>
-                    </a:xfrm>
-                    <a:prstGeom prst="rect">
-                      <a:avLst/>
-                    </a:prstGeom>
-                  </pic:spPr>
-                </pic:pic>
-              </a:graphicData>
-            </a:graphic>
-          </wp:inline>
-        </w:drawing>
-      </w:r>
+      <w:pPr>
+        <w:rPr>
+          <w:lang w:val="en-GB"/>
+        </w:rPr>
+      </w:pPr>
+      <w:r>
+        <w:rPr>
+          <w:lang w:val="en-GB"/>
+        </w:rPr>
+        <w:t xml:space="preserve">git </w:t>
+      </w:r>
+      <w:proofErr w:type="spellStart"/>
+      <w:r>
+        <w:rPr>
+          <w:lang w:val="en-GB"/>
+        </w:rPr>
+        <w:t>init</w:t>
+      </w:r>
+      <w:proofErr w:type="spellEnd"/>
     </w:p>
-    <w:p/>
+    <w:p>
+      <w:pPr>
+        <w:rPr>
+          <w:lang w:val="en-GB"/>
+        </w:rPr>
+      </w:pPr>
+      <w:r>
+        <w:rPr>
+          <w:lang w:val="en-GB"/>
+        </w:rPr>
+        <w:t>git add .</w:t>
+      </w:r>
+    </w:p>
+    <w:p>
+      <w:pPr>
+        <w:rPr>
+          <w:lang w:val="en-GB"/>
+        </w:rPr>
+      </w:pPr>
+      <w:r>
+        <w:rPr>
+          <w:lang w:val="en-GB"/>
+        </w:rPr>
+        <w:t>git commit -m "</w:t>
+      </w:r>
+      <w:proofErr w:type="spellStart"/>
+      <w:r>
+        <w:rPr>
+          <w:lang w:val="en-GB"/>
+        </w:rPr>
+        <w:t>Projeto</w:t>
+      </w:r>
+      <w:proofErr w:type="spellEnd"/>
+      <w:r>
+        <w:rPr>
+          <w:lang w:val="en-GB"/>
+        </w:rPr>
+        <w:t xml:space="preserve"> </w:t>
+      </w:r>
+      <w:proofErr w:type="spellStart"/>
+      <w:r>
+        <w:rPr>
+          <w:lang w:val="en-GB"/>
+        </w:rPr>
+        <w:t>inicial</w:t>
+      </w:r>
+      <w:proofErr w:type="spellEnd"/>
+      <w:r>
+        <w:rPr>
+          <w:lang w:val="en-GB"/>
+        </w:rPr>
+        <w:t xml:space="preserve"> ATV2</w:t>
+      </w:r>
+      <w:r>
+        <w:rPr>
+          <w:lang w:val="en-GB"/>
+        </w:rPr>
+        <w:t>"</w:t>
+      </w:r>
+    </w:p>
+    <w:p>
+      <w:pPr>
+        <w:rPr>
+          <w:lang w:val="en-GB"/>
+        </w:rPr>
+      </w:pPr>
+      <w:r>
+        <w:rPr>
+          <w:lang w:val="en-GB"/>
+        </w:rPr>
+        <w:t>git remote add origin https://github.com/ArturSilvaCosta/ATV</w:t>
+      </w:r>
+      <w:r>
+        <w:rPr>
+          <w:lang w:val="en-GB"/>
+        </w:rPr>
+        <w:t>2-UC11</w:t>
+      </w:r>
+      <w:r>
+        <w:rPr>
+          <w:lang w:val="en-GB"/>
+        </w:rPr>
+        <w:t>.git</w:t>
+      </w:r>
+    </w:p>
+    <w:p>
+      <w:pPr>
+        <w:rPr>
+          <w:lang w:val="en-GB"/>
+        </w:rPr>
+      </w:pPr>
+      <w:r>
+        <w:rPr>
+          <w:lang w:val="en-GB"/>
+        </w:rPr>
+        <w:t>git branch -m main</w:t>
+      </w:r>
+    </w:p>
+    <w:p>
+      <w:pPr>
+        <w:rPr>
+          <w:lang w:val="en-GB"/>
+        </w:rPr>
+      </w:pPr>
+      <w:r>
+        <w:rPr>
+          <w:lang w:val="en-GB"/>
+        </w:rPr>
+        <w:t>git push -u origin main</w:t>
+      </w:r>
+    </w:p>
+    <w:p>
+      <w:pPr>
+        <w:pStyle w:val="PargrafodaLista"/>
+        <w:rPr>
+          <w:sz w:val="28"/>
+          <w:szCs w:val="28"/>
+        </w:rPr>
+      </w:pPr>
+    </w:p>
+    <w:p>
+      <w:pPr>
+        <w:pStyle w:val="PargrafodaLista"/>
+        <w:rPr>
+          <w:sz w:val="28"/>
+          <w:szCs w:val="28"/>
+        </w:rPr>
+      </w:pPr>
+    </w:p>
     <w:p>
       <w:pPr>
         <w:pStyle w:val="PargrafodaLista"/>
@@ -151,434 +281,49 @@
           <w:ilvl w:val="0"/>
           <w:numId w:val="1"/>
         </w:numPr>
-      </w:pPr>
-      <w:r>
-        <w:rPr>
-          <w:sz w:val="28"/>
-          <w:szCs w:val="28"/>
-        </w:rPr>
-        <w:t>Comandos digitados no git Bash</w:t>
-      </w:r>
-      <w:r>
-        <w:rPr>
-          <w:sz w:val="28"/>
-          <w:szCs w:val="28"/>
-        </w:rPr>
-        <w:t xml:space="preserve"> para </w:t>
-      </w:r>
-      <w:r>
-        <w:rPr>
-          <w:sz w:val="28"/>
-          <w:szCs w:val="28"/>
-        </w:rPr>
-        <w:t>Commit 1 (“Projeto inicial”).</w:t>
+        <w:rPr>
+          <w:sz w:val="28"/>
+          <w:szCs w:val="28"/>
+        </w:rPr>
+      </w:pPr>
+      <w:r>
+        <w:rPr>
+          <w:sz w:val="28"/>
+          <w:szCs w:val="28"/>
+        </w:rPr>
+        <w:t xml:space="preserve">Comandos para o novo </w:t>
+      </w:r>
+      <w:proofErr w:type="spellStart"/>
+      <w:r>
+        <w:rPr>
+          <w:sz w:val="28"/>
+          <w:szCs w:val="28"/>
+        </w:rPr>
+        <w:t>commit</w:t>
+      </w:r>
+      <w:proofErr w:type="spellEnd"/>
+      <w:r>
+        <w:rPr>
+          <w:sz w:val="28"/>
+          <w:szCs w:val="28"/>
+        </w:rPr>
+        <w:t>.</w:t>
       </w:r>
     </w:p>
     <w:p>
-      <w:pPr>
-        <w:rPr>
-          <w:lang w:val="en-GB"/>
-        </w:rPr>
-      </w:pPr>
-      <w:r>
-        <w:rPr>
-          <w:lang w:val="en-GB"/>
-        </w:rPr>
-        <w:t>git init</w:t>
+      <w:r>
+        <w:rPr>
+          <w:lang w:val="en-GB"/>
+        </w:rPr>
+        <w:t xml:space="preserve">git </w:t>
+      </w:r>
+      <w:r>
+        <w:rPr>
+          <w:lang w:val="en-GB"/>
+        </w:rPr>
+        <w:t>add .</w:t>
       </w:r>
     </w:p>
-    <w:p>
-      <w:pPr>
-        <w:rPr>
-          <w:lang w:val="en-GB"/>
-        </w:rPr>
-      </w:pPr>
-      <w:r>
-        <w:rPr>
-          <w:lang w:val="en-GB"/>
-        </w:rPr>
-        <w:t>git add .</w:t>
-      </w:r>
-    </w:p>
-    <w:p>
-      <w:pPr>
-        <w:rPr>
-          <w:lang w:val="en-GB"/>
-        </w:rPr>
-      </w:pPr>
-      <w:r>
-        <w:rPr>
-          <w:lang w:val="en-GB"/>
-        </w:rPr>
-        <w:t>git commit -m "Projeto inicial"</w:t>
-      </w:r>
-    </w:p>
-    <w:p>
-      <w:pPr>
-        <w:rPr>
-          <w:lang w:val="en-GB"/>
-        </w:rPr>
-      </w:pPr>
-      <w:r>
-        <w:rPr>
-          <w:lang w:val="en-GB"/>
-        </w:rPr>
-        <w:t>git remote add origin https://github.com/ArturSilvaCosta/Git-UC11-ATV1.git</w:t>
-      </w:r>
-    </w:p>
-    <w:p>
-      <w:pPr>
-        <w:rPr>
-          <w:lang w:val="en-GB"/>
-        </w:rPr>
-      </w:pPr>
-      <w:r>
-        <w:rPr>
-          <w:lang w:val="en-GB"/>
-        </w:rPr>
-        <w:t>git branch -m main</w:t>
-      </w:r>
-    </w:p>
-    <w:p>
-      <w:pPr>
-        <w:rPr>
-          <w:lang w:val="en-GB"/>
-        </w:rPr>
-      </w:pPr>
-      <w:r>
-        <w:rPr>
-          <w:lang w:val="en-GB"/>
-        </w:rPr>
-        <w:t>git push -u origin main</w:t>
-      </w:r>
-    </w:p>
-    <w:p>
-      <w:pPr>
-        <w:rPr>
-          <w:lang w:val="en-GB"/>
-        </w:rPr>
-      </w:pPr>
-      <w:r>
-        <w:rPr>
-          <w:noProof/>
-        </w:rPr>
-        <w:lastRenderedPageBreak/>
-        <w:drawing>
-          <wp:inline distT="0" distB="0" distL="0" distR="0" wp14:anchorId="127F6762" wp14:editId="38BE8883">
-            <wp:extent cx="5400040" cy="3035935"/>
-            <wp:effectExtent l="0" t="0" r="0" b="0"/>
-            <wp:docPr id="2033542211" name="Imagem 1"/>
-            <wp:cNvGraphicFramePr>
-              <a:graphicFrameLocks xmlns:a="http://schemas.openxmlformats.org/drawingml/2006/main" noChangeAspect="1"/>
-            </wp:cNvGraphicFramePr>
-            <a:graphic xmlns:a="http://schemas.openxmlformats.org/drawingml/2006/main">
-              <a:graphicData uri="http://schemas.openxmlformats.org/drawingml/2006/picture">
-                <pic:pic xmlns:pic="http://schemas.openxmlformats.org/drawingml/2006/picture">
-                  <pic:nvPicPr>
-                    <pic:cNvPr id="2033542211" name=""/>
-                    <pic:cNvPicPr/>
-                  </pic:nvPicPr>
-                  <pic:blipFill>
-                    <a:blip r:embed="rId6"/>
-                    <a:stretch>
-                      <a:fillRect/>
-                    </a:stretch>
-                  </pic:blipFill>
-                  <pic:spPr>
-                    <a:xfrm>
-                      <a:off x="0" y="0"/>
-                      <a:ext cx="5400040" cy="3035935"/>
-                    </a:xfrm>
-                    <a:prstGeom prst="rect">
-                      <a:avLst/>
-                    </a:prstGeom>
-                  </pic:spPr>
-                </pic:pic>
-              </a:graphicData>
-            </a:graphic>
-          </wp:inline>
-        </w:drawing>
-      </w:r>
-    </w:p>
-    <w:p>
-      <w:pPr>
-        <w:rPr>
-          <w:lang w:val="en-GB"/>
-        </w:rPr>
-      </w:pPr>
-    </w:p>
-    <w:p>
-      <w:pPr>
-        <w:pStyle w:val="PargrafodaLista"/>
-        <w:numPr>
-          <w:ilvl w:val="0"/>
-          <w:numId w:val="1"/>
-        </w:numPr>
-        <w:rPr>
-          <w:sz w:val="28"/>
-          <w:szCs w:val="28"/>
-        </w:rPr>
-      </w:pPr>
-      <w:r>
-        <w:rPr>
-          <w:sz w:val="28"/>
-          <w:szCs w:val="28"/>
-        </w:rPr>
-        <w:t>Criação do</w:t>
-      </w:r>
-      <w:r>
-        <w:rPr>
-          <w:sz w:val="28"/>
-          <w:szCs w:val="28"/>
-        </w:rPr>
-        <w:t xml:space="preserve"> </w:t>
-      </w:r>
-      <w:r>
-        <w:rPr>
-          <w:sz w:val="28"/>
-          <w:szCs w:val="28"/>
-        </w:rPr>
-        <w:t>README</w:t>
-      </w:r>
-      <w:r>
-        <w:rPr>
-          <w:sz w:val="28"/>
-          <w:szCs w:val="28"/>
-        </w:rPr>
-        <w:t xml:space="preserve"> e commit.</w:t>
-      </w:r>
-    </w:p>
-    <w:p>
-      <w:pPr>
-        <w:ind w:left="360"/>
-      </w:pPr>
-      <w:r>
-        <w:rPr>
-          <w:noProof/>
-        </w:rPr>
-        <w:drawing>
-          <wp:inline distT="0" distB="0" distL="0" distR="0" wp14:anchorId="487D1AD7" wp14:editId="6FB1D20F">
-            <wp:extent cx="5400040" cy="3035935"/>
-            <wp:effectExtent l="0" t="0" r="0" b="0"/>
-            <wp:docPr id="276665433" name="Imagem 1"/>
-            <wp:cNvGraphicFramePr>
-              <a:graphicFrameLocks xmlns:a="http://schemas.openxmlformats.org/drawingml/2006/main" noChangeAspect="1"/>
-            </wp:cNvGraphicFramePr>
-            <a:graphic xmlns:a="http://schemas.openxmlformats.org/drawingml/2006/main">
-              <a:graphicData uri="http://schemas.openxmlformats.org/drawingml/2006/picture">
-                <pic:pic xmlns:pic="http://schemas.openxmlformats.org/drawingml/2006/picture">
-                  <pic:nvPicPr>
-                    <pic:cNvPr id="276665433" name=""/>
-                    <pic:cNvPicPr/>
-                  </pic:nvPicPr>
-                  <pic:blipFill>
-                    <a:blip r:embed="rId7"/>
-                    <a:stretch>
-                      <a:fillRect/>
-                    </a:stretch>
-                  </pic:blipFill>
-                  <pic:spPr>
-                    <a:xfrm>
-                      <a:off x="0" y="0"/>
-                      <a:ext cx="5400040" cy="3035935"/>
-                    </a:xfrm>
-                    <a:prstGeom prst="rect">
-                      <a:avLst/>
-                    </a:prstGeom>
-                  </pic:spPr>
-                </pic:pic>
-              </a:graphicData>
-            </a:graphic>
-          </wp:inline>
-        </w:drawing>
-      </w:r>
-    </w:p>
-    <w:p>
-      <w:pPr>
-        <w:ind w:left="360"/>
-      </w:pPr>
-    </w:p>
-    <w:p>
-      <w:pPr>
-        <w:pStyle w:val="PargrafodaLista"/>
-        <w:numPr>
-          <w:ilvl w:val="0"/>
-          <w:numId w:val="1"/>
-        </w:numPr>
-        <w:rPr>
-          <w:sz w:val="28"/>
-          <w:szCs w:val="28"/>
-        </w:rPr>
-      </w:pPr>
-      <w:r>
-        <w:rPr>
-          <w:sz w:val="28"/>
-          <w:szCs w:val="28"/>
-        </w:rPr>
-        <w:t>Criando um branch</w:t>
-      </w:r>
-      <w:r>
-        <w:rPr>
-          <w:sz w:val="28"/>
-          <w:szCs w:val="28"/>
-        </w:rPr>
-        <w:t xml:space="preserve"> para </w:t>
-      </w:r>
-      <w:r>
-        <w:rPr>
-          <w:sz w:val="28"/>
-          <w:szCs w:val="28"/>
-        </w:rPr>
-        <w:t>adicionar o relatório no repositório.</w:t>
-      </w:r>
-    </w:p>
-    <w:p>
-      <w:pPr>
-        <w:pStyle w:val="PargrafodaLista"/>
-        <w:rPr>
-          <w:sz w:val="28"/>
-          <w:szCs w:val="28"/>
-        </w:rPr>
-      </w:pPr>
-      <w:r>
-        <w:rPr>
-          <w:noProof/>
-        </w:rPr>
-        <w:lastRenderedPageBreak/>
-        <w:drawing>
-          <wp:inline distT="0" distB="0" distL="0" distR="0" wp14:anchorId="606504C4" wp14:editId="587EFD60">
-            <wp:extent cx="5400040" cy="3035935"/>
-            <wp:effectExtent l="0" t="0" r="0" b="0"/>
-            <wp:docPr id="908075724" name="Imagem 1"/>
-            <wp:cNvGraphicFramePr>
-              <a:graphicFrameLocks xmlns:a="http://schemas.openxmlformats.org/drawingml/2006/main" noChangeAspect="1"/>
-            </wp:cNvGraphicFramePr>
-            <a:graphic xmlns:a="http://schemas.openxmlformats.org/drawingml/2006/main">
-              <a:graphicData uri="http://schemas.openxmlformats.org/drawingml/2006/picture">
-                <pic:pic xmlns:pic="http://schemas.openxmlformats.org/drawingml/2006/picture">
-                  <pic:nvPicPr>
-                    <pic:cNvPr id="908075724" name=""/>
-                    <pic:cNvPicPr/>
-                  </pic:nvPicPr>
-                  <pic:blipFill>
-                    <a:blip r:embed="rId8"/>
-                    <a:stretch>
-                      <a:fillRect/>
-                    </a:stretch>
-                  </pic:blipFill>
-                  <pic:spPr>
-                    <a:xfrm>
-                      <a:off x="0" y="0"/>
-                      <a:ext cx="5400040" cy="3035935"/>
-                    </a:xfrm>
-                    <a:prstGeom prst="rect">
-                      <a:avLst/>
-                    </a:prstGeom>
-                  </pic:spPr>
-                </pic:pic>
-              </a:graphicData>
-            </a:graphic>
-          </wp:inline>
-        </w:drawing>
-      </w:r>
-    </w:p>
-    <w:p>
-      <w:pPr>
-        <w:pStyle w:val="PargrafodaLista"/>
-        <w:rPr>
-          <w:sz w:val="28"/>
-          <w:szCs w:val="28"/>
-        </w:rPr>
-      </w:pPr>
-    </w:p>
-    <w:p>
-      <w:pPr>
-        <w:pStyle w:val="PargrafodaLista"/>
-        <w:numPr>
-          <w:ilvl w:val="0"/>
-          <w:numId w:val="1"/>
-        </w:numPr>
-        <w:rPr>
-          <w:sz w:val="28"/>
-          <w:szCs w:val="28"/>
-        </w:rPr>
-      </w:pPr>
-      <w:r>
-        <w:rPr>
-          <w:sz w:val="28"/>
-          <w:szCs w:val="28"/>
-        </w:rPr>
-        <w:t>Comandos para o novo commit</w:t>
-      </w:r>
-      <w:r>
-        <w:rPr>
-          <w:sz w:val="28"/>
-          <w:szCs w:val="28"/>
-        </w:rPr>
-        <w:t>.</w:t>
-      </w:r>
-    </w:p>
-    <w:p>
-      <w:pPr>
-        <w:rPr>
-          <w:lang w:val="en-GB"/>
-        </w:rPr>
-      </w:pPr>
-      <w:r>
-        <w:rPr>
-          <w:lang w:val="en-GB"/>
-        </w:rPr>
-        <w:t>git pull</w:t>
-      </w:r>
-    </w:p>
-    <w:p>
-      <w:pPr>
-        <w:rPr>
-          <w:lang w:val="en-GB"/>
-        </w:rPr>
-      </w:pPr>
-      <w:r>
-        <w:rPr>
-          <w:lang w:val="en-GB"/>
-        </w:rPr>
-        <w:t xml:space="preserve">git branch -m </w:t>
-      </w:r>
-      <w:r>
-        <w:rPr>
-          <w:lang w:val="en-GB"/>
-        </w:rPr>
-        <w:t>relatório</w:t>
-      </w:r>
-    </w:p>
-    <w:p>
-      <w:r>
-        <w:t>git rm “Comandos Git.txt”</w:t>
-      </w:r>
-    </w:p>
-    <w:p>
-      <w:r>
-        <w:t>git rm “Imagem 1.png”</w:t>
-      </w:r>
-    </w:p>
-    <w:p>
-      <w:r>
-        <w:t>git add .</w:t>
-      </w:r>
-    </w:p>
-    <w:p>
-      <w:r>
-        <w:t xml:space="preserve">git commit </w:t>
-      </w:r>
-      <w:r>
-        <w:t>-m “Relatório adicionado”</w:t>
-      </w:r>
-    </w:p>
-    <w:p>
-      <w:r>
-        <w:t>git push -u origin relatorio</w:t>
-      </w:r>
-    </w:p>
-    <w:p/>
     <w:sectPr>
       <w:pgSz w:w="11906" w:h="16838"/>
       <w:pgMar w:top="720" w:right="720" w:bottom="720" w:left="720" w:header="708" w:footer="708" w:gutter="0"/>

</xml_diff>

<commit_message>
Implementada a função do botão CADASTRAR para salvar itens no BD
</commit_message>
<xml_diff>
--- a/Relatorio ATV2.docx
+++ b/Relatorio ATV2.docx
@@ -155,8 +155,16 @@
         <w:rPr>
           <w:lang w:val="en-GB"/>
         </w:rPr>
-        <w:t>git add .</w:t>
-      </w:r>
+        <w:t xml:space="preserve">git </w:t>
+      </w:r>
+      <w:proofErr w:type="gramStart"/>
+      <w:r>
+        <w:rPr>
+          <w:lang w:val="en-GB"/>
+        </w:rPr>
+        <w:t>add .</w:t>
+      </w:r>
+      <w:proofErr w:type="gramEnd"/>
     </w:p>
     <w:p>
       <w:pPr>
@@ -262,15 +270,7 @@
         <w:rPr>
           <w:sz w:val="28"/>
           <w:szCs w:val="28"/>
-        </w:rPr>
-      </w:pPr>
-    </w:p>
-    <w:p>
-      <w:pPr>
-        <w:pStyle w:val="PargrafodaLista"/>
-        <w:rPr>
-          <w:sz w:val="28"/>
-          <w:szCs w:val="28"/>
+          <w:lang w:val="en-GB"/>
         </w:rPr>
       </w:pPr>
     </w:p>
@@ -286,43 +286,337 @@
           <w:szCs w:val="28"/>
         </w:rPr>
       </w:pPr>
-      <w:r>
-        <w:rPr>
-          <w:sz w:val="28"/>
-          <w:szCs w:val="28"/>
-        </w:rPr>
-        <w:t xml:space="preserve">Comandos para o novo </w:t>
-      </w:r>
       <w:proofErr w:type="spellStart"/>
       <w:r>
         <w:rPr>
           <w:sz w:val="28"/>
           <w:szCs w:val="28"/>
         </w:rPr>
+        <w:t>C</w:t>
+      </w:r>
+      <w:r>
+        <w:rPr>
+          <w:sz w:val="28"/>
+          <w:szCs w:val="28"/>
+        </w:rPr>
+        <w:t>ommit</w:t>
+      </w:r>
+      <w:proofErr w:type="spellEnd"/>
+      <w:r>
+        <w:rPr>
+          <w:sz w:val="28"/>
+          <w:szCs w:val="28"/>
+        </w:rPr>
+        <w:t xml:space="preserve"> </w:t>
+      </w:r>
+      <w:r>
+        <w:rPr>
+          <w:sz w:val="28"/>
+          <w:szCs w:val="28"/>
+        </w:rPr>
+        <w:t xml:space="preserve">(2) </w:t>
+      </w:r>
+      <w:r>
+        <w:rPr>
+          <w:sz w:val="28"/>
+          <w:szCs w:val="28"/>
+        </w:rPr>
+        <w:t>definindo a tela inicial</w:t>
+      </w:r>
+    </w:p>
+    <w:p>
+      <w:r>
+        <w:t>(Após implementação n</w:t>
+      </w:r>
+      <w:r>
+        <w:t xml:space="preserve">o projeto </w:t>
+      </w:r>
+      <w:proofErr w:type="gramStart"/>
+      <w:r>
+        <w:t>Java)...</w:t>
+      </w:r>
+      <w:proofErr w:type="gramEnd"/>
+    </w:p>
+    <w:p>
+      <w:pPr>
+        <w:rPr>
+          <w:lang w:val="en-GB"/>
+        </w:rPr>
+      </w:pPr>
+      <w:r>
+        <w:rPr>
+          <w:lang w:val="en-GB"/>
+        </w:rPr>
+        <w:t xml:space="preserve">git </w:t>
+      </w:r>
+      <w:proofErr w:type="gramStart"/>
+      <w:r>
+        <w:rPr>
+          <w:lang w:val="en-GB"/>
+        </w:rPr>
+        <w:t>add .</w:t>
+      </w:r>
+      <w:proofErr w:type="gramEnd"/>
+    </w:p>
+    <w:p>
+      <w:pPr>
+        <w:rPr>
+          <w:lang w:val="en-GB"/>
+        </w:rPr>
+      </w:pPr>
+      <w:r>
+        <w:rPr>
+          <w:lang w:val="en-GB"/>
+        </w:rPr>
+        <w:t>git commit -m “</w:t>
+      </w:r>
+      <w:proofErr w:type="spellStart"/>
+      <w:r>
+        <w:rPr>
+          <w:lang w:val="en-GB"/>
+        </w:rPr>
+        <w:t>cadastroVIEW</w:t>
+      </w:r>
+      <w:proofErr w:type="spellEnd"/>
+      <w:r>
+        <w:rPr>
+          <w:lang w:val="en-GB"/>
+        </w:rPr>
+        <w:t xml:space="preserve"> </w:t>
+      </w:r>
+      <w:proofErr w:type="spellStart"/>
+      <w:r>
+        <w:rPr>
+          <w:lang w:val="en-GB"/>
+        </w:rPr>
+        <w:t>definido</w:t>
+      </w:r>
+      <w:proofErr w:type="spellEnd"/>
+      <w:r>
+        <w:rPr>
+          <w:lang w:val="en-GB"/>
+        </w:rPr>
+        <w:t xml:space="preserve"> </w:t>
+      </w:r>
+      <w:proofErr w:type="spellStart"/>
+      <w:r>
+        <w:rPr>
+          <w:lang w:val="en-GB"/>
+        </w:rPr>
+        <w:t>como</w:t>
+      </w:r>
+      <w:proofErr w:type="spellEnd"/>
+      <w:r>
+        <w:rPr>
+          <w:lang w:val="en-GB"/>
+        </w:rPr>
+        <w:t xml:space="preserve"> </w:t>
+      </w:r>
+      <w:proofErr w:type="spellStart"/>
+      <w:r>
+        <w:rPr>
+          <w:lang w:val="en-GB"/>
+        </w:rPr>
+        <w:t>classe</w:t>
+      </w:r>
+      <w:proofErr w:type="spellEnd"/>
+      <w:r>
+        <w:rPr>
+          <w:lang w:val="en-GB"/>
+        </w:rPr>
+        <w:t xml:space="preserve"> Main (</w:t>
+      </w:r>
+      <w:proofErr w:type="spellStart"/>
+      <w:r>
+        <w:rPr>
+          <w:lang w:val="en-GB"/>
+        </w:rPr>
+        <w:t>tela</w:t>
+      </w:r>
+      <w:proofErr w:type="spellEnd"/>
+      <w:r>
+        <w:rPr>
+          <w:lang w:val="en-GB"/>
+        </w:rPr>
+        <w:t xml:space="preserve"> principal)”</w:t>
+      </w:r>
+    </w:p>
+    <w:p>
+      <w:pPr>
+        <w:rPr>
+          <w:lang w:val="en-GB"/>
+        </w:rPr>
+      </w:pPr>
+      <w:r>
+        <w:rPr>
+          <w:lang w:val="en-GB"/>
+        </w:rPr>
+        <w:t xml:space="preserve">git push </w:t>
+      </w:r>
+      <w:r>
+        <w:rPr>
+          <w:lang w:val="en-GB"/>
+        </w:rPr>
+        <w:t>-u origin main</w:t>
+      </w:r>
+    </w:p>
+    <w:p>
+      <w:pPr>
+        <w:rPr>
+          <w:lang w:val="en-GB"/>
+        </w:rPr>
+      </w:pPr>
+    </w:p>
+    <w:p>
+      <w:pPr>
+        <w:pStyle w:val="PargrafodaLista"/>
+        <w:numPr>
+          <w:ilvl w:val="0"/>
+          <w:numId w:val="1"/>
+        </w:numPr>
+        <w:rPr>
+          <w:sz w:val="28"/>
+          <w:szCs w:val="28"/>
+        </w:rPr>
+      </w:pPr>
+      <w:proofErr w:type="spellStart"/>
+      <w:r>
+        <w:rPr>
+          <w:sz w:val="28"/>
+          <w:szCs w:val="28"/>
+        </w:rPr>
+        <w:t>Commit</w:t>
+      </w:r>
+      <w:proofErr w:type="spellEnd"/>
+      <w:r>
+        <w:rPr>
+          <w:sz w:val="28"/>
+          <w:szCs w:val="28"/>
+        </w:rPr>
+        <w:t xml:space="preserve"> </w:t>
+      </w:r>
+      <w:r>
+        <w:rPr>
+          <w:sz w:val="28"/>
+          <w:szCs w:val="28"/>
+        </w:rPr>
+        <w:t xml:space="preserve">(3) </w:t>
+      </w:r>
+      <w:r>
+        <w:rPr>
+          <w:sz w:val="28"/>
+          <w:szCs w:val="28"/>
+        </w:rPr>
+        <w:t>configurando botão salvar</w:t>
+      </w:r>
+    </w:p>
+    <w:p>
+      <w:r>
+        <w:t>(Após implementação n</w:t>
+      </w:r>
+      <w:r>
+        <w:t>o projeto Java</w:t>
+      </w:r>
+      <w:r>
+        <w:t xml:space="preserve"> e correção do script SQL para </w:t>
+      </w:r>
+      <w:r>
+        <w:t xml:space="preserve">criar o </w:t>
+      </w:r>
+      <w:proofErr w:type="gramStart"/>
+      <w:r>
+        <w:t>BD</w:t>
+      </w:r>
+      <w:r>
+        <w:t>)...</w:t>
+      </w:r>
+      <w:proofErr w:type="gramEnd"/>
+    </w:p>
+    <w:p>
+      <w:proofErr w:type="spellStart"/>
+      <w:r>
+        <w:t>git</w:t>
+      </w:r>
+      <w:proofErr w:type="spellEnd"/>
+      <w:r>
+        <w:t xml:space="preserve"> </w:t>
+      </w:r>
+      <w:proofErr w:type="spellStart"/>
+      <w:proofErr w:type="gramStart"/>
+      <w:r>
+        <w:t>add</w:t>
+      </w:r>
+      <w:proofErr w:type="spellEnd"/>
+      <w:r>
+        <w:t xml:space="preserve"> .</w:t>
+      </w:r>
+      <w:proofErr w:type="gramEnd"/>
+    </w:p>
+    <w:p>
+      <w:proofErr w:type="spellStart"/>
+      <w:r>
+        <w:t>git</w:t>
+      </w:r>
+      <w:proofErr w:type="spellEnd"/>
+      <w:r>
+        <w:t xml:space="preserve"> </w:t>
+      </w:r>
+      <w:proofErr w:type="spellStart"/>
+      <w:r>
         <w:t>commit</w:t>
       </w:r>
       <w:proofErr w:type="spellEnd"/>
       <w:r>
-        <w:rPr>
-          <w:sz w:val="28"/>
-          <w:szCs w:val="28"/>
-        </w:rPr>
-        <w:t>.</w:t>
-      </w:r>
-    </w:p>
-    <w:p>
-      <w:r>
-        <w:rPr>
-          <w:lang w:val="en-GB"/>
-        </w:rPr>
-        <w:t xml:space="preserve">git </w:t>
-      </w:r>
-      <w:r>
-        <w:rPr>
-          <w:lang w:val="en-GB"/>
-        </w:rPr>
-        <w:t>add .</w:t>
-      </w:r>
+        <w:t xml:space="preserve"> -m “</w:t>
+      </w:r>
+      <w:r>
+        <w:t xml:space="preserve">Implementada a função </w:t>
+      </w:r>
+      <w:r>
+        <w:t>do botão CADASTRAR</w:t>
+      </w:r>
+      <w:r>
+        <w:t xml:space="preserve"> </w:t>
+      </w:r>
+      <w:r>
+        <w:t xml:space="preserve">para </w:t>
+      </w:r>
+      <w:r>
+        <w:t>salvar</w:t>
+      </w:r>
+      <w:r>
+        <w:t xml:space="preserve"> itens no BD</w:t>
+      </w:r>
+      <w:r>
+        <w:t>”</w:t>
+      </w:r>
+    </w:p>
+    <w:p>
+      <w:pPr>
+        <w:rPr>
+          <w:lang w:val="en-GB"/>
+        </w:rPr>
+      </w:pPr>
+      <w:r>
+        <w:rPr>
+          <w:lang w:val="en-GB"/>
+        </w:rPr>
+        <w:t>git push -u origin main</w:t>
+      </w:r>
+    </w:p>
+    <w:p>
+      <w:pPr>
+        <w:rPr>
+          <w:lang w:val="en-GB"/>
+        </w:rPr>
+      </w:pPr>
+    </w:p>
+    <w:p>
+      <w:pPr>
+        <w:rPr>
+          <w:lang w:val="en-GB"/>
+        </w:rPr>
+      </w:pPr>
     </w:p>
     <w:sectPr>
       <w:pgSz w:w="11906" w:h="16838"/>
@@ -337,9 +631,95 @@
 <file path=word/numbering.xml><?xml version="1.0" encoding="utf-8"?>
 <w:numbering xmlns:wpc="http://schemas.microsoft.com/office/word/2010/wordprocessingCanvas" xmlns:cx="http://schemas.microsoft.com/office/drawing/2014/chartex" xmlns:cx1="http://schemas.microsoft.com/office/drawing/2015/9/8/chartex" xmlns:cx2="http://schemas.microsoft.com/office/drawing/2015/10/21/chartex" xmlns:cx3="http://schemas.microsoft.com/office/drawing/2016/5/9/chartex" xmlns:cx4="http://schemas.microsoft.com/office/drawing/2016/5/10/chartex" xmlns:cx5="http://schemas.microsoft.com/office/drawing/2016/5/11/chartex" xmlns:cx6="http://schemas.microsoft.com/office/drawing/2016/5/12/chartex" xmlns:cx7="http://schemas.microsoft.com/office/drawing/2016/5/13/chartex" xmlns:cx8="http://schemas.microsoft.com/office/drawing/2016/5/14/chartex" xmlns:mc="http://schemas.openxmlformats.org/markup-compatibility/2006" xmlns:aink="http://schemas.microsoft.com/office/drawing/2016/ink" xmlns:am3d="http://schemas.microsoft.com/office/drawing/2017/model3d" xmlns:o="urn:schemas-microsoft-com:office:office" xmlns:oel="http://schemas.microsoft.com/office/2019/extlst" xmlns:r="http://schemas.openxmlformats.org/officeDocument/2006/relationships" xmlns:m="http://schemas.openxmlformats.org/officeDocument/2006/math" xmlns:v="urn:schemas-microsoft-com:vml" xmlns:wp14="http://schemas.microsoft.com/office/word/2010/wordprocessingDrawing" xmlns:wp="http://schemas.openxmlformats.org/drawingml/2006/wordprocessingDrawing" xmlns:w10="urn:schemas-microsoft-com:office:word" xmlns:w="http://schemas.openxmlformats.org/wordprocessingml/2006/main" xmlns:w14="http://schemas.microsoft.com/office/word/2010/wordml" xmlns:w15="http://schemas.microsoft.com/office/word/2012/wordml" xmlns:w16cex="http://schemas.microsoft.com/office/word/2018/wordml/cex" xmlns:w16cid="http://schemas.microsoft.com/office/word/2016/wordml/cid" xmlns:w16="http://schemas.microsoft.com/office/word/2018/wordml" xmlns:w16du="http://schemas.microsoft.com/office/word/2023/wordml/word16du" xmlns:w16sdtdh="http://schemas.microsoft.com/office/word/2020/wordml/sdtdatahash" xmlns:w16sdtfl="http://schemas.microsoft.com/office/word/2024/wordml/sdtformatlock" xmlns:w16se="http://schemas.microsoft.com/office/word/2015/wordml/symex" xmlns:wpg="http://schemas.microsoft.com/office/word/2010/wordprocessingGroup" xmlns:wpi="http://schemas.microsoft.com/office/word/2010/wordprocessingInk" xmlns:wne="http://schemas.microsoft.com/office/word/2006/wordml" xmlns:wps="http://schemas.microsoft.com/office/word/2010/wordprocessingShape" mc:Ignorable="w14 w15 w16se w16cid w16 w16cex w16sdtdh w16sdtfl w16du wp14">
   <w:abstractNum w:abstractNumId="0" w15:restartNumberingAfterBreak="0">
+    <w:nsid w:val="2A541830"/>
+    <w:multiLevelType w:val="hybridMultilevel"/>
+    <w:tmpl w:val="592C81D2"/>
+    <w:lvl w:ilvl="0" w:tplc="FFFFFFFF">
+      <w:start w:val="1"/>
+      <w:numFmt w:val="decimal"/>
+      <w:lvlText w:val="%1."/>
+      <w:lvlJc w:val="left"/>
+      <w:pPr>
+        <w:ind w:left="720" w:hanging="360"/>
+      </w:pPr>
+    </w:lvl>
+    <w:lvl w:ilvl="1" w:tplc="FFFFFFFF" w:tentative="1">
+      <w:start w:val="1"/>
+      <w:numFmt w:val="lowerLetter"/>
+      <w:lvlText w:val="%2."/>
+      <w:lvlJc w:val="left"/>
+      <w:pPr>
+        <w:ind w:left="1440" w:hanging="360"/>
+      </w:pPr>
+    </w:lvl>
+    <w:lvl w:ilvl="2" w:tplc="FFFFFFFF" w:tentative="1">
+      <w:start w:val="1"/>
+      <w:numFmt w:val="lowerRoman"/>
+      <w:lvlText w:val="%3."/>
+      <w:lvlJc w:val="right"/>
+      <w:pPr>
+        <w:ind w:left="2160" w:hanging="180"/>
+      </w:pPr>
+    </w:lvl>
+    <w:lvl w:ilvl="3" w:tplc="FFFFFFFF" w:tentative="1">
+      <w:start w:val="1"/>
+      <w:numFmt w:val="decimal"/>
+      <w:lvlText w:val="%4."/>
+      <w:lvlJc w:val="left"/>
+      <w:pPr>
+        <w:ind w:left="2880" w:hanging="360"/>
+      </w:pPr>
+    </w:lvl>
+    <w:lvl w:ilvl="4" w:tplc="FFFFFFFF" w:tentative="1">
+      <w:start w:val="1"/>
+      <w:numFmt w:val="lowerLetter"/>
+      <w:lvlText w:val="%5."/>
+      <w:lvlJc w:val="left"/>
+      <w:pPr>
+        <w:ind w:left="3600" w:hanging="360"/>
+      </w:pPr>
+    </w:lvl>
+    <w:lvl w:ilvl="5" w:tplc="FFFFFFFF" w:tentative="1">
+      <w:start w:val="1"/>
+      <w:numFmt w:val="lowerRoman"/>
+      <w:lvlText w:val="%6."/>
+      <w:lvlJc w:val="right"/>
+      <w:pPr>
+        <w:ind w:left="4320" w:hanging="180"/>
+      </w:pPr>
+    </w:lvl>
+    <w:lvl w:ilvl="6" w:tplc="FFFFFFFF" w:tentative="1">
+      <w:start w:val="1"/>
+      <w:numFmt w:val="decimal"/>
+      <w:lvlText w:val="%7."/>
+      <w:lvlJc w:val="left"/>
+      <w:pPr>
+        <w:ind w:left="5040" w:hanging="360"/>
+      </w:pPr>
+    </w:lvl>
+    <w:lvl w:ilvl="7" w:tplc="FFFFFFFF" w:tentative="1">
+      <w:start w:val="1"/>
+      <w:numFmt w:val="lowerLetter"/>
+      <w:lvlText w:val="%8."/>
+      <w:lvlJc w:val="left"/>
+      <w:pPr>
+        <w:ind w:left="5760" w:hanging="360"/>
+      </w:pPr>
+    </w:lvl>
+    <w:lvl w:ilvl="8" w:tplc="FFFFFFFF" w:tentative="1">
+      <w:start w:val="1"/>
+      <w:numFmt w:val="lowerRoman"/>
+      <w:lvlText w:val="%9."/>
+      <w:lvlJc w:val="right"/>
+      <w:pPr>
+        <w:ind w:left="6480" w:hanging="180"/>
+      </w:pPr>
+    </w:lvl>
+  </w:abstractNum>
+  <w:abstractNum w:abstractNumId="1" w15:restartNumberingAfterBreak="0">
     <w:nsid w:val="3D3F5B0C"/>
     <w:multiLevelType w:val="hybridMultilevel"/>
-    <w:tmpl w:val="592C81D2"/>
+    <w:tmpl w:val="7EFC1A6C"/>
     <w:lvl w:ilvl="0" w:tplc="0416000F">
       <w:start w:val="1"/>
       <w:numFmt w:val="decimal"/>
@@ -423,6 +803,9 @@
     </w:lvl>
   </w:abstractNum>
   <w:num w:numId="1" w16cid:durableId="2095710322">
+    <w:abstractNumId w:val="1"/>
+  </w:num>
+  <w:num w:numId="2" w16cid:durableId="225143678">
     <w:abstractNumId w:val="0"/>
   </w:num>
 </w:numbering>
@@ -828,7 +1211,7 @@
   <w:style w:type="paragraph" w:default="1" w:styleId="Normal">
     <w:name w:val="Normal"/>
     <w:qFormat/>
-    <w:rsid w:val="008E4669"/>
+    <w:rsid w:val="0029443F"/>
   </w:style>
   <w:style w:type="paragraph" w:styleId="Ttulo1">
     <w:name w:val="heading 1"/>

</xml_diff>

<commit_message>
Adicionada a mensagem de confirmação ou erro no cadastro
</commit_message>
<xml_diff>
--- a/Relatorio ATV2.docx
+++ b/Relatorio ATV2.docx
@@ -613,11 +613,135 @@
     </w:p>
     <w:p>
       <w:pPr>
-        <w:rPr>
-          <w:lang w:val="en-GB"/>
-        </w:rPr>
-      </w:pPr>
-    </w:p>
+        <w:pStyle w:val="PargrafodaLista"/>
+        <w:numPr>
+          <w:ilvl w:val="0"/>
+          <w:numId w:val="1"/>
+        </w:numPr>
+        <w:rPr>
+          <w:sz w:val="28"/>
+          <w:szCs w:val="28"/>
+        </w:rPr>
+      </w:pPr>
+      <w:proofErr w:type="spellStart"/>
+      <w:r>
+        <w:rPr>
+          <w:sz w:val="28"/>
+          <w:szCs w:val="28"/>
+        </w:rPr>
+        <w:t>Commit</w:t>
+      </w:r>
+      <w:proofErr w:type="spellEnd"/>
+      <w:r>
+        <w:rPr>
+          <w:sz w:val="28"/>
+          <w:szCs w:val="28"/>
+        </w:rPr>
+        <w:t xml:space="preserve"> (</w:t>
+      </w:r>
+      <w:r>
+        <w:rPr>
+          <w:sz w:val="28"/>
+          <w:szCs w:val="28"/>
+        </w:rPr>
+        <w:t>4</w:t>
+      </w:r>
+      <w:r>
+        <w:rPr>
+          <w:sz w:val="28"/>
+          <w:szCs w:val="28"/>
+        </w:rPr>
+        <w:t xml:space="preserve">) </w:t>
+      </w:r>
+      <w:r>
+        <w:rPr>
+          <w:sz w:val="28"/>
+          <w:szCs w:val="28"/>
+        </w:rPr>
+        <w:t>mensagem de erro/confirmação de cadastro</w:t>
+      </w:r>
+    </w:p>
+    <w:p>
+      <w:r>
+        <w:t>(Após implementação n</w:t>
+      </w:r>
+      <w:r>
+        <w:t xml:space="preserve">o projeto </w:t>
+      </w:r>
+      <w:proofErr w:type="gramStart"/>
+      <w:r>
+        <w:t>Java)...</w:t>
+      </w:r>
+      <w:proofErr w:type="gramEnd"/>
+    </w:p>
+    <w:p>
+      <w:proofErr w:type="spellStart"/>
+      <w:r>
+        <w:t>git</w:t>
+      </w:r>
+      <w:proofErr w:type="spellEnd"/>
+      <w:r>
+        <w:t xml:space="preserve"> </w:t>
+      </w:r>
+      <w:proofErr w:type="spellStart"/>
+      <w:proofErr w:type="gramStart"/>
+      <w:r>
+        <w:t>add</w:t>
+      </w:r>
+      <w:proofErr w:type="spellEnd"/>
+      <w:r>
+        <w:t xml:space="preserve"> .</w:t>
+      </w:r>
+      <w:proofErr w:type="gramEnd"/>
+    </w:p>
+    <w:p>
+      <w:proofErr w:type="spellStart"/>
+      <w:r>
+        <w:t>git</w:t>
+      </w:r>
+      <w:proofErr w:type="spellEnd"/>
+      <w:r>
+        <w:t xml:space="preserve"> </w:t>
+      </w:r>
+      <w:proofErr w:type="spellStart"/>
+      <w:r>
+        <w:t>commit</w:t>
+      </w:r>
+      <w:proofErr w:type="spellEnd"/>
+      <w:r>
+        <w:t xml:space="preserve"> -m “</w:t>
+      </w:r>
+      <w:r>
+        <w:t>Adicionada a mensagem de confirmação ou erro no cadastro</w:t>
+      </w:r>
+      <w:r>
+        <w:t>”</w:t>
+      </w:r>
+    </w:p>
+    <w:p>
+      <w:pPr>
+        <w:rPr>
+          <w:lang w:val="en-GB"/>
+        </w:rPr>
+      </w:pPr>
+      <w:r>
+        <w:rPr>
+          <w:lang w:val="en-GB"/>
+        </w:rPr>
+        <w:t>git push -u origin main</w:t>
+      </w:r>
+    </w:p>
+    <w:p>
+      <w:pPr>
+        <w:pStyle w:val="PargrafodaLista"/>
+        <w:ind w:left="360"/>
+        <w:rPr>
+          <w:sz w:val="28"/>
+          <w:szCs w:val="28"/>
+        </w:rPr>
+      </w:pPr>
+    </w:p>
+    <w:p/>
     <w:sectPr>
       <w:pgSz w:w="11906" w:h="16838"/>
       <w:pgMar w:top="720" w:right="720" w:bottom="720" w:left="720" w:header="708" w:footer="708" w:gutter="0"/>
@@ -719,7 +843,7 @@
   <w:abstractNum w:abstractNumId="1" w15:restartNumberingAfterBreak="0">
     <w:nsid w:val="3D3F5B0C"/>
     <w:multiLevelType w:val="hybridMultilevel"/>
-    <w:tmpl w:val="7EFC1A6C"/>
+    <w:tmpl w:val="48904C58"/>
     <w:lvl w:ilvl="0" w:tplc="0416000F">
       <w:start w:val="1"/>
       <w:numFmt w:val="decimal"/>
@@ -793,6 +917,92 @@
       </w:pPr>
     </w:lvl>
     <w:lvl w:ilvl="8" w:tplc="0416001B" w:tentative="1">
+      <w:start w:val="1"/>
+      <w:numFmt w:val="lowerRoman"/>
+      <w:lvlText w:val="%9."/>
+      <w:lvlJc w:val="right"/>
+      <w:pPr>
+        <w:ind w:left="6480" w:hanging="180"/>
+      </w:pPr>
+    </w:lvl>
+  </w:abstractNum>
+  <w:abstractNum w:abstractNumId="2" w15:restartNumberingAfterBreak="0">
+    <w:nsid w:val="4EA845A5"/>
+    <w:multiLevelType w:val="hybridMultilevel"/>
+    <w:tmpl w:val="7EFC1A6C"/>
+    <w:lvl w:ilvl="0" w:tplc="FFFFFFFF">
+      <w:start w:val="1"/>
+      <w:numFmt w:val="decimal"/>
+      <w:lvlText w:val="%1."/>
+      <w:lvlJc w:val="left"/>
+      <w:pPr>
+        <w:ind w:left="720" w:hanging="360"/>
+      </w:pPr>
+    </w:lvl>
+    <w:lvl w:ilvl="1" w:tplc="FFFFFFFF" w:tentative="1">
+      <w:start w:val="1"/>
+      <w:numFmt w:val="lowerLetter"/>
+      <w:lvlText w:val="%2."/>
+      <w:lvlJc w:val="left"/>
+      <w:pPr>
+        <w:ind w:left="1440" w:hanging="360"/>
+      </w:pPr>
+    </w:lvl>
+    <w:lvl w:ilvl="2" w:tplc="FFFFFFFF" w:tentative="1">
+      <w:start w:val="1"/>
+      <w:numFmt w:val="lowerRoman"/>
+      <w:lvlText w:val="%3."/>
+      <w:lvlJc w:val="right"/>
+      <w:pPr>
+        <w:ind w:left="2160" w:hanging="180"/>
+      </w:pPr>
+    </w:lvl>
+    <w:lvl w:ilvl="3" w:tplc="FFFFFFFF" w:tentative="1">
+      <w:start w:val="1"/>
+      <w:numFmt w:val="decimal"/>
+      <w:lvlText w:val="%4."/>
+      <w:lvlJc w:val="left"/>
+      <w:pPr>
+        <w:ind w:left="2880" w:hanging="360"/>
+      </w:pPr>
+    </w:lvl>
+    <w:lvl w:ilvl="4" w:tplc="FFFFFFFF" w:tentative="1">
+      <w:start w:val="1"/>
+      <w:numFmt w:val="lowerLetter"/>
+      <w:lvlText w:val="%5."/>
+      <w:lvlJc w:val="left"/>
+      <w:pPr>
+        <w:ind w:left="3600" w:hanging="360"/>
+      </w:pPr>
+    </w:lvl>
+    <w:lvl w:ilvl="5" w:tplc="FFFFFFFF" w:tentative="1">
+      <w:start w:val="1"/>
+      <w:numFmt w:val="lowerRoman"/>
+      <w:lvlText w:val="%6."/>
+      <w:lvlJc w:val="right"/>
+      <w:pPr>
+        <w:ind w:left="4320" w:hanging="180"/>
+      </w:pPr>
+    </w:lvl>
+    <w:lvl w:ilvl="6" w:tplc="FFFFFFFF" w:tentative="1">
+      <w:start w:val="1"/>
+      <w:numFmt w:val="decimal"/>
+      <w:lvlText w:val="%7."/>
+      <w:lvlJc w:val="left"/>
+      <w:pPr>
+        <w:ind w:left="5040" w:hanging="360"/>
+      </w:pPr>
+    </w:lvl>
+    <w:lvl w:ilvl="7" w:tplc="FFFFFFFF" w:tentative="1">
+      <w:start w:val="1"/>
+      <w:numFmt w:val="lowerLetter"/>
+      <w:lvlText w:val="%8."/>
+      <w:lvlJc w:val="left"/>
+      <w:pPr>
+        <w:ind w:left="5760" w:hanging="360"/>
+      </w:pPr>
+    </w:lvl>
+    <w:lvl w:ilvl="8" w:tplc="FFFFFFFF" w:tentative="1">
       <w:start w:val="1"/>
       <w:numFmt w:val="lowerRoman"/>
       <w:lvlText w:val="%9."/>
@@ -807,6 +1017,9 @@
   </w:num>
   <w:num w:numId="2" w16cid:durableId="225143678">
     <w:abstractNumId w:val="0"/>
+  </w:num>
+  <w:num w:numId="3" w16cid:durableId="203448340">
+    <w:abstractNumId w:val="2"/>
   </w:num>
 </w:numbering>
 </file>
@@ -1211,7 +1424,7 @@
   <w:style w:type="paragraph" w:default="1" w:styleId="Normal">
     <w:name w:val="Normal"/>
     <w:qFormat/>
-    <w:rsid w:val="0029443F"/>
+    <w:rsid w:val="001E6A6D"/>
   </w:style>
   <w:style w:type="paragraph" w:styleId="Ttulo1">
     <w:name w:val="heading 1"/>

</xml_diff>

<commit_message>
Adicionada a listagem na tela dos produtos cadastrados no BD
</commit_message>
<xml_diff>
--- a/Relatorio ATV2.docx
+++ b/Relatorio ATV2.docx
@@ -637,28 +637,7 @@
           <w:sz w:val="28"/>
           <w:szCs w:val="28"/>
         </w:rPr>
-        <w:t xml:space="preserve"> (</w:t>
-      </w:r>
-      <w:r>
-        <w:rPr>
-          <w:sz w:val="28"/>
-          <w:szCs w:val="28"/>
-        </w:rPr>
-        <w:t>4</w:t>
-      </w:r>
-      <w:r>
-        <w:rPr>
-          <w:sz w:val="28"/>
-          <w:szCs w:val="28"/>
-        </w:rPr>
-        <w:t xml:space="preserve">) </w:t>
-      </w:r>
-      <w:r>
-        <w:rPr>
-          <w:sz w:val="28"/>
-          <w:szCs w:val="28"/>
-        </w:rPr>
-        <w:t>mensagem de erro/confirmação de cadastro</w:t>
+        <w:t xml:space="preserve"> (4) mensagem de erro/confirmação de cadastro</w:t>
       </w:r>
     </w:p>
     <w:p>
@@ -738,6 +717,164 @@
         <w:rPr>
           <w:sz w:val="28"/>
           <w:szCs w:val="28"/>
+        </w:rPr>
+      </w:pPr>
+    </w:p>
+    <w:p>
+      <w:pPr>
+        <w:pStyle w:val="PargrafodaLista"/>
+        <w:numPr>
+          <w:ilvl w:val="0"/>
+          <w:numId w:val="1"/>
+        </w:numPr>
+        <w:rPr>
+          <w:sz w:val="28"/>
+          <w:szCs w:val="28"/>
+        </w:rPr>
+      </w:pPr>
+      <w:proofErr w:type="spellStart"/>
+      <w:r>
+        <w:rPr>
+          <w:sz w:val="28"/>
+          <w:szCs w:val="28"/>
+        </w:rPr>
+        <w:t>Commit</w:t>
+      </w:r>
+      <w:proofErr w:type="spellEnd"/>
+      <w:r>
+        <w:rPr>
+          <w:sz w:val="28"/>
+          <w:szCs w:val="28"/>
+        </w:rPr>
+        <w:t xml:space="preserve"> (5) listagem de produtos</w:t>
+      </w:r>
+    </w:p>
+    <w:p>
+      <w:r>
+        <w:t>(Após implementação n</w:t>
+      </w:r>
+      <w:r>
+        <w:t xml:space="preserve">o projeto </w:t>
+      </w:r>
+      <w:proofErr w:type="gramStart"/>
+      <w:r>
+        <w:t>Java)...</w:t>
+      </w:r>
+      <w:proofErr w:type="gramEnd"/>
+    </w:p>
+    <w:p>
+      <w:proofErr w:type="spellStart"/>
+      <w:r>
+        <w:t>git</w:t>
+      </w:r>
+      <w:proofErr w:type="spellEnd"/>
+      <w:r>
+        <w:t xml:space="preserve"> </w:t>
+      </w:r>
+      <w:proofErr w:type="spellStart"/>
+      <w:proofErr w:type="gramStart"/>
+      <w:r>
+        <w:t>add</w:t>
+      </w:r>
+      <w:proofErr w:type="spellEnd"/>
+      <w:r>
+        <w:t xml:space="preserve"> .</w:t>
+      </w:r>
+      <w:proofErr w:type="gramEnd"/>
+    </w:p>
+    <w:p>
+      <w:proofErr w:type="spellStart"/>
+      <w:r>
+        <w:t>git</w:t>
+      </w:r>
+      <w:proofErr w:type="spellEnd"/>
+      <w:r>
+        <w:t xml:space="preserve"> </w:t>
+      </w:r>
+      <w:proofErr w:type="spellStart"/>
+      <w:r>
+        <w:t>commit</w:t>
+      </w:r>
+      <w:proofErr w:type="spellEnd"/>
+      <w:r>
+        <w:t xml:space="preserve"> -m “</w:t>
+      </w:r>
+      <w:r>
+        <w:t>Adicionada</w:t>
+      </w:r>
+      <w:r>
+        <w:t xml:space="preserve"> a listagem na tela dos produtos cadastrados no BD</w:t>
+      </w:r>
+      <w:r>
+        <w:t>”</w:t>
+      </w:r>
+    </w:p>
+    <w:p>
+      <w:pPr>
+        <w:rPr>
+          <w:lang w:val="en-GB"/>
+        </w:rPr>
+      </w:pPr>
+      <w:r>
+        <w:rPr>
+          <w:lang w:val="en-GB"/>
+        </w:rPr>
+        <w:lastRenderedPageBreak/>
+        <w:t>git push -u origin main</w:t>
+      </w:r>
+    </w:p>
+    <w:p>
+      <w:pPr>
+        <w:rPr>
+          <w:lang w:val="en-GB"/>
+        </w:rPr>
+      </w:pPr>
+    </w:p>
+    <w:p>
+      <w:pPr>
+        <w:pStyle w:val="PargrafodaLista"/>
+        <w:numPr>
+          <w:ilvl w:val="0"/>
+          <w:numId w:val="1"/>
+        </w:numPr>
+        <w:rPr>
+          <w:sz w:val="28"/>
+          <w:szCs w:val="28"/>
+        </w:rPr>
+      </w:pPr>
+      <w:r>
+        <w:rPr>
+          <w:sz w:val="28"/>
+          <w:szCs w:val="28"/>
+        </w:rPr>
+        <w:t xml:space="preserve">Prints </w:t>
+      </w:r>
+      <w:r>
+        <w:rPr>
+          <w:sz w:val="28"/>
+          <w:szCs w:val="28"/>
+        </w:rPr>
+        <w:t>do repositório</w:t>
+      </w:r>
+    </w:p>
+    <w:p>
+      <w:pPr>
+        <w:rPr>
+          <w:lang w:val="en-GB"/>
+        </w:rPr>
+      </w:pPr>
+    </w:p>
+    <w:p>
+      <w:pPr>
+        <w:rPr>
+          <w:lang w:val="en-GB"/>
+        </w:rPr>
+      </w:pPr>
+    </w:p>
+    <w:p>
+      <w:pPr>
+        <w:rPr>
+          <w:lang w:val="en-GB"/>
         </w:rPr>
       </w:pPr>
     </w:p>
@@ -755,6 +892,92 @@
 <file path=word/numbering.xml><?xml version="1.0" encoding="utf-8"?>
 <w:numbering xmlns:wpc="http://schemas.microsoft.com/office/word/2010/wordprocessingCanvas" xmlns:cx="http://schemas.microsoft.com/office/drawing/2014/chartex" xmlns:cx1="http://schemas.microsoft.com/office/drawing/2015/9/8/chartex" xmlns:cx2="http://schemas.microsoft.com/office/drawing/2015/10/21/chartex" xmlns:cx3="http://schemas.microsoft.com/office/drawing/2016/5/9/chartex" xmlns:cx4="http://schemas.microsoft.com/office/drawing/2016/5/10/chartex" xmlns:cx5="http://schemas.microsoft.com/office/drawing/2016/5/11/chartex" xmlns:cx6="http://schemas.microsoft.com/office/drawing/2016/5/12/chartex" xmlns:cx7="http://schemas.microsoft.com/office/drawing/2016/5/13/chartex" xmlns:cx8="http://schemas.microsoft.com/office/drawing/2016/5/14/chartex" xmlns:mc="http://schemas.openxmlformats.org/markup-compatibility/2006" xmlns:aink="http://schemas.microsoft.com/office/drawing/2016/ink" xmlns:am3d="http://schemas.microsoft.com/office/drawing/2017/model3d" xmlns:o="urn:schemas-microsoft-com:office:office" xmlns:oel="http://schemas.microsoft.com/office/2019/extlst" xmlns:r="http://schemas.openxmlformats.org/officeDocument/2006/relationships" xmlns:m="http://schemas.openxmlformats.org/officeDocument/2006/math" xmlns:v="urn:schemas-microsoft-com:vml" xmlns:wp14="http://schemas.microsoft.com/office/word/2010/wordprocessingDrawing" xmlns:wp="http://schemas.openxmlformats.org/drawingml/2006/wordprocessingDrawing" xmlns:w10="urn:schemas-microsoft-com:office:word" xmlns:w="http://schemas.openxmlformats.org/wordprocessingml/2006/main" xmlns:w14="http://schemas.microsoft.com/office/word/2010/wordml" xmlns:w15="http://schemas.microsoft.com/office/word/2012/wordml" xmlns:w16cex="http://schemas.microsoft.com/office/word/2018/wordml/cex" xmlns:w16cid="http://schemas.microsoft.com/office/word/2016/wordml/cid" xmlns:w16="http://schemas.microsoft.com/office/word/2018/wordml" xmlns:w16du="http://schemas.microsoft.com/office/word/2023/wordml/word16du" xmlns:w16sdtdh="http://schemas.microsoft.com/office/word/2020/wordml/sdtdatahash" xmlns:w16sdtfl="http://schemas.microsoft.com/office/word/2024/wordml/sdtformatlock" xmlns:w16se="http://schemas.microsoft.com/office/word/2015/wordml/symex" xmlns:wpg="http://schemas.microsoft.com/office/word/2010/wordprocessingGroup" xmlns:wpi="http://schemas.microsoft.com/office/word/2010/wordprocessingInk" xmlns:wne="http://schemas.microsoft.com/office/word/2006/wordml" xmlns:wps="http://schemas.microsoft.com/office/word/2010/wordprocessingShape" mc:Ignorable="w14 w15 w16se w16cid w16 w16cex w16sdtdh w16sdtfl w16du wp14">
   <w:abstractNum w:abstractNumId="0" w15:restartNumberingAfterBreak="0">
+    <w:nsid w:val="228E6A16"/>
+    <w:multiLevelType w:val="hybridMultilevel"/>
+    <w:tmpl w:val="D36EC5E4"/>
+    <w:lvl w:ilvl="0" w:tplc="FFFFFFFF">
+      <w:start w:val="1"/>
+      <w:numFmt w:val="decimal"/>
+      <w:lvlText w:val="%1."/>
+      <w:lvlJc w:val="left"/>
+      <w:pPr>
+        <w:ind w:left="720" w:hanging="360"/>
+      </w:pPr>
+    </w:lvl>
+    <w:lvl w:ilvl="1" w:tplc="FFFFFFFF" w:tentative="1">
+      <w:start w:val="1"/>
+      <w:numFmt w:val="lowerLetter"/>
+      <w:lvlText w:val="%2."/>
+      <w:lvlJc w:val="left"/>
+      <w:pPr>
+        <w:ind w:left="1440" w:hanging="360"/>
+      </w:pPr>
+    </w:lvl>
+    <w:lvl w:ilvl="2" w:tplc="FFFFFFFF" w:tentative="1">
+      <w:start w:val="1"/>
+      <w:numFmt w:val="lowerRoman"/>
+      <w:lvlText w:val="%3."/>
+      <w:lvlJc w:val="right"/>
+      <w:pPr>
+        <w:ind w:left="2160" w:hanging="180"/>
+      </w:pPr>
+    </w:lvl>
+    <w:lvl w:ilvl="3" w:tplc="FFFFFFFF" w:tentative="1">
+      <w:start w:val="1"/>
+      <w:numFmt w:val="decimal"/>
+      <w:lvlText w:val="%4."/>
+      <w:lvlJc w:val="left"/>
+      <w:pPr>
+        <w:ind w:left="2880" w:hanging="360"/>
+      </w:pPr>
+    </w:lvl>
+    <w:lvl w:ilvl="4" w:tplc="FFFFFFFF" w:tentative="1">
+      <w:start w:val="1"/>
+      <w:numFmt w:val="lowerLetter"/>
+      <w:lvlText w:val="%5."/>
+      <w:lvlJc w:val="left"/>
+      <w:pPr>
+        <w:ind w:left="3600" w:hanging="360"/>
+      </w:pPr>
+    </w:lvl>
+    <w:lvl w:ilvl="5" w:tplc="FFFFFFFF" w:tentative="1">
+      <w:start w:val="1"/>
+      <w:numFmt w:val="lowerRoman"/>
+      <w:lvlText w:val="%6."/>
+      <w:lvlJc w:val="right"/>
+      <w:pPr>
+        <w:ind w:left="4320" w:hanging="180"/>
+      </w:pPr>
+    </w:lvl>
+    <w:lvl w:ilvl="6" w:tplc="FFFFFFFF" w:tentative="1">
+      <w:start w:val="1"/>
+      <w:numFmt w:val="decimal"/>
+      <w:lvlText w:val="%7."/>
+      <w:lvlJc w:val="left"/>
+      <w:pPr>
+        <w:ind w:left="5040" w:hanging="360"/>
+      </w:pPr>
+    </w:lvl>
+    <w:lvl w:ilvl="7" w:tplc="FFFFFFFF" w:tentative="1">
+      <w:start w:val="1"/>
+      <w:numFmt w:val="lowerLetter"/>
+      <w:lvlText w:val="%8."/>
+      <w:lvlJc w:val="left"/>
+      <w:pPr>
+        <w:ind w:left="5760" w:hanging="360"/>
+      </w:pPr>
+    </w:lvl>
+    <w:lvl w:ilvl="8" w:tplc="FFFFFFFF" w:tentative="1">
+      <w:start w:val="1"/>
+      <w:numFmt w:val="lowerRoman"/>
+      <w:lvlText w:val="%9."/>
+      <w:lvlJc w:val="right"/>
+      <w:pPr>
+        <w:ind w:left="6480" w:hanging="180"/>
+      </w:pPr>
+    </w:lvl>
+  </w:abstractNum>
+  <w:abstractNum w:abstractNumId="1" w15:restartNumberingAfterBreak="0">
     <w:nsid w:val="2A541830"/>
     <w:multiLevelType w:val="hybridMultilevel"/>
     <w:tmpl w:val="592C81D2"/>
@@ -840,10 +1063,10 @@
       </w:pPr>
     </w:lvl>
   </w:abstractNum>
-  <w:abstractNum w:abstractNumId="1" w15:restartNumberingAfterBreak="0">
+  <w:abstractNum w:abstractNumId="2" w15:restartNumberingAfterBreak="0">
     <w:nsid w:val="3D3F5B0C"/>
     <w:multiLevelType w:val="hybridMultilevel"/>
-    <w:tmpl w:val="48904C58"/>
+    <w:tmpl w:val="5A62F768"/>
     <w:lvl w:ilvl="0" w:tplc="0416000F">
       <w:start w:val="1"/>
       <w:numFmt w:val="decimal"/>
@@ -926,7 +1149,7 @@
       </w:pPr>
     </w:lvl>
   </w:abstractNum>
-  <w:abstractNum w:abstractNumId="2" w15:restartNumberingAfterBreak="0">
+  <w:abstractNum w:abstractNumId="3" w15:restartNumberingAfterBreak="0">
     <w:nsid w:val="4EA845A5"/>
     <w:multiLevelType w:val="hybridMultilevel"/>
     <w:tmpl w:val="7EFC1A6C"/>
@@ -1012,14 +1235,106 @@
       </w:pPr>
     </w:lvl>
   </w:abstractNum>
+  <w:abstractNum w:abstractNumId="4" w15:restartNumberingAfterBreak="0">
+    <w:nsid w:val="52DB5FBA"/>
+    <w:multiLevelType w:val="hybridMultilevel"/>
+    <w:tmpl w:val="48904C58"/>
+    <w:lvl w:ilvl="0" w:tplc="FFFFFFFF">
+      <w:start w:val="1"/>
+      <w:numFmt w:val="decimal"/>
+      <w:lvlText w:val="%1."/>
+      <w:lvlJc w:val="left"/>
+      <w:pPr>
+        <w:ind w:left="720" w:hanging="360"/>
+      </w:pPr>
+    </w:lvl>
+    <w:lvl w:ilvl="1" w:tplc="FFFFFFFF" w:tentative="1">
+      <w:start w:val="1"/>
+      <w:numFmt w:val="lowerLetter"/>
+      <w:lvlText w:val="%2."/>
+      <w:lvlJc w:val="left"/>
+      <w:pPr>
+        <w:ind w:left="1440" w:hanging="360"/>
+      </w:pPr>
+    </w:lvl>
+    <w:lvl w:ilvl="2" w:tplc="FFFFFFFF" w:tentative="1">
+      <w:start w:val="1"/>
+      <w:numFmt w:val="lowerRoman"/>
+      <w:lvlText w:val="%3."/>
+      <w:lvlJc w:val="right"/>
+      <w:pPr>
+        <w:ind w:left="2160" w:hanging="180"/>
+      </w:pPr>
+    </w:lvl>
+    <w:lvl w:ilvl="3" w:tplc="FFFFFFFF" w:tentative="1">
+      <w:start w:val="1"/>
+      <w:numFmt w:val="decimal"/>
+      <w:lvlText w:val="%4."/>
+      <w:lvlJc w:val="left"/>
+      <w:pPr>
+        <w:ind w:left="2880" w:hanging="360"/>
+      </w:pPr>
+    </w:lvl>
+    <w:lvl w:ilvl="4" w:tplc="FFFFFFFF" w:tentative="1">
+      <w:start w:val="1"/>
+      <w:numFmt w:val="lowerLetter"/>
+      <w:lvlText w:val="%5."/>
+      <w:lvlJc w:val="left"/>
+      <w:pPr>
+        <w:ind w:left="3600" w:hanging="360"/>
+      </w:pPr>
+    </w:lvl>
+    <w:lvl w:ilvl="5" w:tplc="FFFFFFFF" w:tentative="1">
+      <w:start w:val="1"/>
+      <w:numFmt w:val="lowerRoman"/>
+      <w:lvlText w:val="%6."/>
+      <w:lvlJc w:val="right"/>
+      <w:pPr>
+        <w:ind w:left="4320" w:hanging="180"/>
+      </w:pPr>
+    </w:lvl>
+    <w:lvl w:ilvl="6" w:tplc="FFFFFFFF" w:tentative="1">
+      <w:start w:val="1"/>
+      <w:numFmt w:val="decimal"/>
+      <w:lvlText w:val="%7."/>
+      <w:lvlJc w:val="left"/>
+      <w:pPr>
+        <w:ind w:left="5040" w:hanging="360"/>
+      </w:pPr>
+    </w:lvl>
+    <w:lvl w:ilvl="7" w:tplc="FFFFFFFF" w:tentative="1">
+      <w:start w:val="1"/>
+      <w:numFmt w:val="lowerLetter"/>
+      <w:lvlText w:val="%8."/>
+      <w:lvlJc w:val="left"/>
+      <w:pPr>
+        <w:ind w:left="5760" w:hanging="360"/>
+      </w:pPr>
+    </w:lvl>
+    <w:lvl w:ilvl="8" w:tplc="FFFFFFFF" w:tentative="1">
+      <w:start w:val="1"/>
+      <w:numFmt w:val="lowerRoman"/>
+      <w:lvlText w:val="%9."/>
+      <w:lvlJc w:val="right"/>
+      <w:pPr>
+        <w:ind w:left="6480" w:hanging="180"/>
+      </w:pPr>
+    </w:lvl>
+  </w:abstractNum>
   <w:num w:numId="1" w16cid:durableId="2095710322">
+    <w:abstractNumId w:val="2"/>
+  </w:num>
+  <w:num w:numId="2" w16cid:durableId="225143678">
     <w:abstractNumId w:val="1"/>
   </w:num>
-  <w:num w:numId="2" w16cid:durableId="225143678">
+  <w:num w:numId="3" w16cid:durableId="203448340">
+    <w:abstractNumId w:val="3"/>
+  </w:num>
+  <w:num w:numId="4" w16cid:durableId="489293561">
+    <w:abstractNumId w:val="4"/>
+  </w:num>
+  <w:num w:numId="5" w16cid:durableId="441538904">
     <w:abstractNumId w:val="0"/>
-  </w:num>
-  <w:num w:numId="3" w16cid:durableId="203448340">
-    <w:abstractNumId w:val="2"/>
   </w:num>
 </w:numbering>
 </file>
@@ -1424,7 +1739,7 @@
   <w:style w:type="paragraph" w:default="1" w:styleId="Normal">
     <w:name w:val="Normal"/>
     <w:qFormat/>
-    <w:rsid w:val="001E6A6D"/>
+    <w:rsid w:val="008C417A"/>
   </w:style>
   <w:style w:type="paragraph" w:styleId="Ttulo1">
     <w:name w:val="heading 1"/>

</xml_diff>